<commit_message>
add document; remove wsOption.agent while connecting to server without tls.
</commit_message>
<xml_diff>
--- a/Doc/IdentityOnChain 使用说明.docx
+++ b/Doc/IdentityOnChain 使用说明.docx
@@ -78,753 +78,15 @@
         <w:rPr>
           <w:rFonts w:hint="eastAsia"/>
         </w:rPr>
-        <w:t>执行</w:t>
-      </w:r>
-      <w:r>
-        <w:t>start-cometbft.bat</w:t>
-      </w:r>
-      <w:r>
-        <w:t xml:space="preserve"> </w:t>
-      </w:r>
-      <w:r>
-        <w:rPr>
-          <w:rFonts w:hint="eastAsia"/>
-        </w:rPr>
-        <w:t>会启动</w:t>
-      </w:r>
-      <w:r>
-        <w:rPr>
-          <w:rFonts w:hint="eastAsia"/>
-        </w:rPr>
-        <w:t>IdentityOnChain</w:t>
-      </w:r>
-      <w:r>
-        <w:rPr>
-          <w:rFonts w:hint="eastAsia"/>
-        </w:rPr>
-        <w:t>，</w:t>
-      </w:r>
-      <w:r>
-        <w:rPr>
-          <w:rFonts w:hint="eastAsia"/>
-        </w:rPr>
-        <w:t>如果遇到无法启动的情况，请排查是否重复启动，或者端口被占用的情况。</w:t>
-      </w:r>
-    </w:p>
-    <w:p/>
-    <w:tbl>
-      <w:tblPr>
-        <w:tblStyle w:val="ae"/>
-        <w:tblW w:w="8630" w:type="dxa"/>
-        <w:tblLook w:val="04A0" w:firstRow="1" w:lastRow="0" w:firstColumn="1" w:lastColumn="0" w:noHBand="0" w:noVBand="1"/>
-      </w:tblPr>
-      <w:tblGrid>
-        <w:gridCol w:w="1806"/>
-        <w:gridCol w:w="1672"/>
-        <w:gridCol w:w="1798"/>
-        <w:gridCol w:w="1798"/>
-        <w:gridCol w:w="1556"/>
-      </w:tblGrid>
-      <w:tr>
-        <w:tc>
-          <w:tcPr>
-            <w:tcW w:w="1806" w:type="dxa"/>
-          </w:tcPr>
-          <w:p>
-            <w:r>
-              <w:rPr>
-                <w:rFonts w:hint="eastAsia"/>
-              </w:rPr>
-              <w:t>Node</w:t>
-            </w:r>
-            <w:r>
-              <w:rPr>
-                <w:rFonts w:hint="eastAsia"/>
-              </w:rPr>
-              <w:t>名称</w:t>
-            </w:r>
-          </w:p>
-        </w:tc>
-        <w:tc>
-          <w:tcPr>
-            <w:tcW w:w="1672" w:type="dxa"/>
-          </w:tcPr>
-          <w:p>
-            <w:r>
-              <w:t>P2P-port</w:t>
-            </w:r>
-          </w:p>
-        </w:tc>
-        <w:tc>
-          <w:tcPr>
-            <w:tcW w:w="1798" w:type="dxa"/>
-          </w:tcPr>
-          <w:p>
-            <w:r>
-              <w:t>Rpc-port</w:t>
-            </w:r>
-          </w:p>
-        </w:tc>
-        <w:tc>
-          <w:tcPr>
-            <w:tcW w:w="1798" w:type="dxa"/>
-          </w:tcPr>
-          <w:p>
-            <w:r>
-              <w:rPr>
-                <w:rFonts w:hint="eastAsia"/>
-              </w:rPr>
-              <w:t>A</w:t>
-            </w:r>
-            <w:r>
-              <w:t>BCI-port</w:t>
-            </w:r>
-          </w:p>
-        </w:tc>
-        <w:tc>
-          <w:tcPr>
-            <w:tcW w:w="1556" w:type="dxa"/>
-          </w:tcPr>
-          <w:p>
-            <w:r>
-              <w:t>Web-service</w:t>
-            </w:r>
-          </w:p>
-        </w:tc>
-      </w:tr>
-      <w:tr>
-        <w:tc>
-          <w:tcPr>
-            <w:tcW w:w="1806" w:type="dxa"/>
-          </w:tcPr>
-          <w:p>
-            <w:r>
-              <w:rPr>
-                <w:rFonts w:hint="eastAsia"/>
-              </w:rPr>
-              <w:t>Node0</w:t>
-            </w:r>
-          </w:p>
-        </w:tc>
-        <w:tc>
-          <w:tcPr>
-            <w:tcW w:w="1672" w:type="dxa"/>
-          </w:tcPr>
-          <w:p>
-            <w:r>
-              <w:rPr>
-                <w:rFonts w:hint="eastAsia"/>
-              </w:rPr>
-              <w:t>2665</w:t>
-            </w:r>
-            <w:r>
-              <w:t>6</w:t>
-            </w:r>
-          </w:p>
-        </w:tc>
-        <w:tc>
-          <w:tcPr>
-            <w:tcW w:w="1798" w:type="dxa"/>
-          </w:tcPr>
-          <w:p>
-            <w:r>
-              <w:rPr>
-                <w:rFonts w:hint="eastAsia"/>
-              </w:rPr>
-              <w:t>26657</w:t>
-            </w:r>
-          </w:p>
-        </w:tc>
-        <w:tc>
-          <w:tcPr>
-            <w:tcW w:w="1798" w:type="dxa"/>
-          </w:tcPr>
-          <w:p>
-            <w:r>
-              <w:rPr>
-                <w:rFonts w:hint="eastAsia"/>
-              </w:rPr>
-              <w:t>26658</w:t>
-            </w:r>
-          </w:p>
-        </w:tc>
-        <w:tc>
-          <w:tcPr>
-            <w:tcW w:w="1556" w:type="dxa"/>
-          </w:tcPr>
-          <w:p>
-            <w:r>
-              <w:rPr>
-                <w:rFonts w:hint="eastAsia"/>
-              </w:rPr>
-              <w:t>8080</w:t>
-            </w:r>
-          </w:p>
-        </w:tc>
-      </w:tr>
-      <w:tr>
-        <w:tc>
-          <w:tcPr>
-            <w:tcW w:w="1806" w:type="dxa"/>
-          </w:tcPr>
-          <w:p>
-            <w:r>
-              <w:rPr>
-                <w:rFonts w:hint="eastAsia"/>
-              </w:rPr>
-              <w:t>Node1</w:t>
-            </w:r>
-          </w:p>
-        </w:tc>
-        <w:tc>
-          <w:tcPr>
-            <w:tcW w:w="1672" w:type="dxa"/>
-          </w:tcPr>
-          <w:p>
-            <w:r>
-              <w:rPr>
-                <w:rFonts w:hint="eastAsia"/>
-              </w:rPr>
-              <w:t>3665</w:t>
-            </w:r>
-            <w:r>
-              <w:t>6</w:t>
-            </w:r>
-          </w:p>
-        </w:tc>
-        <w:tc>
-          <w:tcPr>
-            <w:tcW w:w="1798" w:type="dxa"/>
-          </w:tcPr>
-          <w:p>
-            <w:r>
-              <w:rPr>
-                <w:rFonts w:hint="eastAsia"/>
-              </w:rPr>
-              <w:t>36657</w:t>
-            </w:r>
-          </w:p>
-        </w:tc>
-        <w:tc>
-          <w:tcPr>
-            <w:tcW w:w="1798" w:type="dxa"/>
-          </w:tcPr>
-          <w:p>
-            <w:r>
-              <w:rPr>
-                <w:rFonts w:hint="eastAsia"/>
-              </w:rPr>
-              <w:t>36658</w:t>
-            </w:r>
-          </w:p>
-        </w:tc>
-        <w:tc>
-          <w:tcPr>
-            <w:tcW w:w="1556" w:type="dxa"/>
-          </w:tcPr>
-          <w:p>
-            <w:r>
-              <w:rPr>
-                <w:rFonts w:hint="eastAsia"/>
-              </w:rPr>
-              <w:t>8081</w:t>
-            </w:r>
-          </w:p>
-        </w:tc>
-      </w:tr>
-      <w:tr>
-        <w:tc>
-          <w:tcPr>
-            <w:tcW w:w="1806" w:type="dxa"/>
-          </w:tcPr>
-          <w:p>
-            <w:r>
-              <w:rPr>
-                <w:rFonts w:hint="eastAsia"/>
-              </w:rPr>
-              <w:t>Node2</w:t>
-            </w:r>
-          </w:p>
-        </w:tc>
-        <w:tc>
-          <w:tcPr>
-            <w:tcW w:w="1672" w:type="dxa"/>
-          </w:tcPr>
-          <w:p>
-            <w:r>
-              <w:rPr>
-                <w:rFonts w:hint="eastAsia"/>
-              </w:rPr>
-              <w:t>4665</w:t>
-            </w:r>
-            <w:r>
-              <w:t>6</w:t>
-            </w:r>
-          </w:p>
-        </w:tc>
-        <w:tc>
-          <w:tcPr>
-            <w:tcW w:w="1798" w:type="dxa"/>
-          </w:tcPr>
-          <w:p>
-            <w:r>
-              <w:rPr>
-                <w:rFonts w:hint="eastAsia"/>
-              </w:rPr>
-              <w:t>46657</w:t>
-            </w:r>
-          </w:p>
-        </w:tc>
-        <w:tc>
-          <w:tcPr>
-            <w:tcW w:w="1798" w:type="dxa"/>
-          </w:tcPr>
-          <w:p>
-            <w:r>
-              <w:rPr>
-                <w:rFonts w:hint="eastAsia"/>
-              </w:rPr>
-              <w:t>46658</w:t>
-            </w:r>
-          </w:p>
-        </w:tc>
-        <w:tc>
-          <w:tcPr>
-            <w:tcW w:w="1556" w:type="dxa"/>
-          </w:tcPr>
-          <w:p>
-            <w:r>
-              <w:rPr>
-                <w:rFonts w:hint="eastAsia"/>
-              </w:rPr>
-              <w:t>8082</w:t>
-            </w:r>
-          </w:p>
-        </w:tc>
-      </w:tr>
-      <w:tr>
-        <w:tc>
-          <w:tcPr>
-            <w:tcW w:w="1806" w:type="dxa"/>
-          </w:tcPr>
-          <w:p>
-            <w:r>
-              <w:rPr>
-                <w:rFonts w:hint="eastAsia"/>
-              </w:rPr>
-              <w:t>Node3</w:t>
-            </w:r>
-          </w:p>
-        </w:tc>
-        <w:tc>
-          <w:tcPr>
-            <w:tcW w:w="1672" w:type="dxa"/>
-          </w:tcPr>
-          <w:p>
-            <w:r>
-              <w:rPr>
-                <w:rFonts w:hint="eastAsia"/>
-              </w:rPr>
-              <w:t>5665</w:t>
-            </w:r>
-            <w:r>
-              <w:t>6</w:t>
-            </w:r>
-          </w:p>
-        </w:tc>
-        <w:tc>
-          <w:tcPr>
-            <w:tcW w:w="1798" w:type="dxa"/>
-          </w:tcPr>
-          <w:p>
-            <w:r>
-              <w:rPr>
-                <w:rFonts w:hint="eastAsia"/>
-              </w:rPr>
-              <w:t>56657</w:t>
-            </w:r>
-          </w:p>
-        </w:tc>
-        <w:tc>
-          <w:tcPr>
-            <w:tcW w:w="1798" w:type="dxa"/>
-          </w:tcPr>
-          <w:p>
-            <w:r>
-              <w:rPr>
-                <w:rFonts w:hint="eastAsia"/>
-              </w:rPr>
-              <w:t>56658</w:t>
-            </w:r>
-          </w:p>
-        </w:tc>
-        <w:tc>
-          <w:tcPr>
-            <w:tcW w:w="1556" w:type="dxa"/>
-          </w:tcPr>
-          <w:p>
-            <w:r>
-              <w:rPr>
-                <w:rFonts w:hint="eastAsia"/>
-              </w:rPr>
-              <w:t>8083</w:t>
-            </w:r>
-          </w:p>
-        </w:tc>
-      </w:tr>
-    </w:tbl>
-    <w:p/>
-    <w:p/>
-    <w:p>
-      <w:r>
-        <w:rPr>
-          <w:rFonts w:hint="eastAsia"/>
-        </w:rPr>
-        <w:t>启动以后，可以简单的通过以下</w:t>
-      </w:r>
-      <w:r>
-        <w:t>URL</w:t>
-      </w:r>
-      <w:r>
-        <w:rPr>
-          <w:rFonts w:hint="eastAsia"/>
-        </w:rPr>
-        <w:t>来判断对应的节点是否启动成功；但是并不能判断对应的</w:t>
-      </w:r>
-      <w:r>
-        <w:rPr>
-          <w:rFonts w:hint="eastAsia"/>
-        </w:rPr>
-        <w:t>application</w:t>
-      </w:r>
-      <w:r>
-        <w:rPr>
-          <w:rFonts w:hint="eastAsia"/>
-        </w:rPr>
-        <w:t>是否启动成功。</w:t>
-      </w:r>
-      <w:r>
-        <w:rPr>
-          <w:rFonts w:hint="eastAsia"/>
-        </w:rPr>
-        <w:t>判断</w:t>
-      </w:r>
-      <w:r>
-        <w:rPr>
-          <w:rFonts w:hint="eastAsia"/>
-        </w:rPr>
-        <w:t>application</w:t>
-      </w:r>
-      <w:r>
-        <w:rPr>
-          <w:rFonts w:hint="eastAsia"/>
-        </w:rPr>
-        <w:t>是否启动成功需要通过</w:t>
-      </w:r>
-      <w:r>
-        <w:rPr>
-          <w:rFonts w:hint="eastAsia"/>
-        </w:rPr>
-        <w:t>webservice</w:t>
-      </w:r>
-      <w:r>
-        <w:t xml:space="preserve"> </w:t>
-      </w:r>
-      <w:r>
-        <w:rPr>
-          <w:rFonts w:hint="eastAsia"/>
-        </w:rPr>
-        <w:t>api</w:t>
-      </w:r>
-      <w:r>
-        <w:rPr>
-          <w:rFonts w:hint="eastAsia"/>
-        </w:rPr>
-        <w:t>。</w:t>
-      </w:r>
-    </w:p>
-    <w:tbl>
-      <w:tblPr>
-        <w:tblStyle w:val="ae"/>
-        <w:tblW w:w="0" w:type="auto"/>
-        <w:tblLook w:val="04A0" w:firstRow="1" w:lastRow="0" w:firstColumn="1" w:lastColumn="0" w:noHBand="0" w:noVBand="1"/>
-      </w:tblPr>
-      <w:tblGrid>
-        <w:gridCol w:w="4315"/>
-        <w:gridCol w:w="4315"/>
-      </w:tblGrid>
-      <w:tr>
-        <w:tc>
-          <w:tcPr>
-            <w:tcW w:w="4315" w:type="dxa"/>
-          </w:tcPr>
-          <w:p>
-            <w:r>
-              <w:t>N</w:t>
-            </w:r>
-            <w:r>
-              <w:rPr>
-                <w:rFonts w:hint="eastAsia"/>
-              </w:rPr>
-              <w:t>ode0</w:t>
-            </w:r>
-          </w:p>
-        </w:tc>
-        <w:tc>
-          <w:tcPr>
-            <w:tcW w:w="4315" w:type="dxa"/>
-          </w:tcPr>
-          <w:p>
-            <w:hyperlink r:id="rId8" w:history="1">
-              <w:r>
-                <w:rPr>
-                  <w:rStyle w:val="a7"/>
-                </w:rPr>
-                <w:t>127.0.0.1:</w:t>
-              </w:r>
-              <w:r>
-                <w:rPr>
-                  <w:rStyle w:val="a7"/>
-                  <w:rFonts w:hint="eastAsia"/>
-                </w:rPr>
-                <w:t>2</w:t>
-              </w:r>
-              <w:r>
-                <w:rPr>
-                  <w:rStyle w:val="a7"/>
-                </w:rPr>
-                <w:t>6657/status</w:t>
-              </w:r>
-            </w:hyperlink>
-          </w:p>
-        </w:tc>
-      </w:tr>
-      <w:tr>
-        <w:tc>
-          <w:tcPr>
-            <w:tcW w:w="4315" w:type="dxa"/>
-          </w:tcPr>
-          <w:p>
-            <w:r>
-              <w:t>N</w:t>
-            </w:r>
-            <w:r>
-              <w:rPr>
-                <w:rFonts w:hint="eastAsia"/>
-              </w:rPr>
-              <w:t>ode1</w:t>
-            </w:r>
-          </w:p>
-        </w:tc>
-        <w:tc>
-          <w:tcPr>
-            <w:tcW w:w="4315" w:type="dxa"/>
-          </w:tcPr>
-          <w:p>
-            <w:hyperlink r:id="rId9" w:history="1">
-              <w:r>
-                <w:rPr>
-                  <w:rStyle w:val="a7"/>
-                </w:rPr>
-                <w:t>127.0.0.1:</w:t>
-              </w:r>
-              <w:r>
-                <w:rPr>
-                  <w:rStyle w:val="a7"/>
-                  <w:rFonts w:hint="eastAsia"/>
-                </w:rPr>
-                <w:t>3</w:t>
-              </w:r>
-              <w:r>
-                <w:rPr>
-                  <w:rStyle w:val="a7"/>
-                </w:rPr>
-                <w:t>6657/status</w:t>
-              </w:r>
-            </w:hyperlink>
-          </w:p>
-        </w:tc>
-      </w:tr>
-      <w:tr>
-        <w:tc>
-          <w:tcPr>
-            <w:tcW w:w="4315" w:type="dxa"/>
-          </w:tcPr>
-          <w:p>
-            <w:r>
-              <w:t>N</w:t>
-            </w:r>
-            <w:r>
-              <w:rPr>
-                <w:rFonts w:hint="eastAsia"/>
-              </w:rPr>
-              <w:t>ode2</w:t>
-            </w:r>
-          </w:p>
-        </w:tc>
-        <w:tc>
-          <w:tcPr>
-            <w:tcW w:w="4315" w:type="dxa"/>
-          </w:tcPr>
-          <w:p>
-            <w:hyperlink r:id="rId10" w:history="1">
-              <w:r>
-                <w:rPr>
-                  <w:rStyle w:val="a7"/>
-                </w:rPr>
-                <w:t>127.0.0.1:</w:t>
-              </w:r>
-              <w:r>
-                <w:rPr>
-                  <w:rStyle w:val="a7"/>
-                  <w:rFonts w:hint="eastAsia"/>
-                </w:rPr>
-                <w:t>4</w:t>
-              </w:r>
-              <w:r>
-                <w:rPr>
-                  <w:rStyle w:val="a7"/>
-                </w:rPr>
-                <w:t>6657/status</w:t>
-              </w:r>
-            </w:hyperlink>
-          </w:p>
-        </w:tc>
-      </w:tr>
-      <w:tr>
-        <w:tc>
-          <w:tcPr>
-            <w:tcW w:w="4315" w:type="dxa"/>
-          </w:tcPr>
-          <w:p>
-            <w:r>
-              <w:t>N</w:t>
-            </w:r>
-            <w:r>
-              <w:rPr>
-                <w:rFonts w:hint="eastAsia"/>
-              </w:rPr>
-              <w:t>ode3</w:t>
-            </w:r>
-          </w:p>
-        </w:tc>
-        <w:tc>
-          <w:tcPr>
-            <w:tcW w:w="4315" w:type="dxa"/>
-          </w:tcPr>
-          <w:p>
-            <w:hyperlink r:id="rId11" w:history="1">
-              <w:r>
-                <w:rPr>
-                  <w:rStyle w:val="a7"/>
-                </w:rPr>
-                <w:t>127.0.0.1:</w:t>
-              </w:r>
-              <w:r>
-                <w:rPr>
-                  <w:rStyle w:val="a7"/>
-                  <w:rFonts w:hint="eastAsia"/>
-                </w:rPr>
-                <w:t>5</w:t>
-              </w:r>
-              <w:r>
-                <w:rPr>
-                  <w:rStyle w:val="a7"/>
-                </w:rPr>
-                <w:t>6657/status</w:t>
-              </w:r>
-            </w:hyperlink>
-          </w:p>
-        </w:tc>
-      </w:tr>
-    </w:tbl>
-    <w:p/>
-    <w:p>
-      <w:r>
-        <w:rPr>
-          <w:rFonts w:hint="eastAsia"/>
-        </w:rPr>
-        <w:t>执行</w:t>
-      </w:r>
-      <w:r>
-        <w:t>stop-cometbft.bat</w:t>
-      </w:r>
-      <w:r>
-        <w:t xml:space="preserve"> </w:t>
-      </w:r>
-      <w:r>
-        <w:rPr>
-          <w:rFonts w:hint="eastAsia"/>
-        </w:rPr>
-        <w:t>会关闭所有的</w:t>
-      </w:r>
-      <w:r>
-        <w:rPr>
-          <w:rFonts w:hint="eastAsia"/>
-        </w:rPr>
-        <w:t>node</w:t>
-      </w:r>
-      <w:r>
-        <w:rPr>
-          <w:rFonts w:hint="eastAsia"/>
-        </w:rPr>
-        <w:t>和</w:t>
-      </w:r>
-      <w:r>
-        <w:rPr>
-          <w:rFonts w:hint="eastAsia"/>
-        </w:rPr>
-        <w:t>application</w:t>
-      </w:r>
-      <w:r>
-        <w:rPr>
-          <w:rFonts w:hint="eastAsia"/>
-        </w:rPr>
-        <w:t>。但是并不会关闭</w:t>
-      </w:r>
-      <w:r>
-        <w:rPr>
-          <w:rFonts w:hint="eastAsia"/>
-        </w:rPr>
-        <w:t>test-web</w:t>
-      </w:r>
-      <w:r>
-        <w:rPr>
-          <w:rFonts w:hint="eastAsia"/>
-        </w:rPr>
-        <w:t>的进程。</w:t>
-      </w:r>
-    </w:p>
-    <w:p/>
-    <w:p>
-      <w:pPr>
-        <w:pStyle w:val="a8"/>
-      </w:pPr>
-      <w:r>
-        <w:rPr>
-          <w:rFonts w:hint="eastAsia"/>
-        </w:rPr>
-        <w:t>测试网页</w:t>
+        <w:t>进入目录</w:t>
+      </w:r>
+      <w:r>
+        <w:t>sample\client\example</w:t>
       </w:r>
     </w:p>
     <w:p>
       <w:r>
-        <w:rPr>
-          <w:rFonts w:hint="eastAsia"/>
-        </w:rPr>
-        <w:t>安装完成以后，打开</w:t>
-      </w:r>
-      <w:r>
-        <w:t>StartTestWebServer.bat</w:t>
-      </w:r>
-      <w:r>
-        <w:t xml:space="preserve"> </w:t>
-      </w:r>
-      <w:r>
-        <w:rPr>
-          <w:rFonts w:hint="eastAsia"/>
-        </w:rPr>
-        <w:t>或者您勾选了启动测试网页的选项，会出现如下窗口，</w:t>
+        <w:t xml:space="preserve">Node server.js </w:t>
       </w:r>
     </w:p>
     <w:p>
@@ -833,83 +95,87 @@
           <w:rFonts w:hint="eastAsia"/>
         </w:rPr>
       </w:pPr>
+      <w:r>
+        <w:rPr>
+          <w:rFonts w:hint="eastAsia"/>
+        </w:rPr>
+        <w:t>会输出一个获取</w:t>
+      </w:r>
+      <w:r>
+        <w:rPr>
+          <w:rFonts w:hint="eastAsia"/>
+        </w:rPr>
+        <w:t>server</w:t>
+      </w:r>
+      <w:r>
+        <w:t xml:space="preserve"> </w:t>
+      </w:r>
+      <w:r>
+        <w:rPr>
+          <w:rFonts w:hint="eastAsia"/>
+        </w:rPr>
+        <w:t>list</w:t>
+      </w:r>
+      <w:r>
+        <w:rPr>
+          <w:rFonts w:hint="eastAsia"/>
+        </w:rPr>
+        <w:t>的</w:t>
+      </w:r>
+      <w:r>
+        <w:rPr>
+          <w:rFonts w:hint="eastAsia"/>
+        </w:rPr>
+        <w:t>U</w:t>
+      </w:r>
+      <w:r>
+        <w:t>RL</w:t>
+      </w:r>
+      <w:r>
+        <w:rPr>
+          <w:rFonts w:hint="eastAsia"/>
+        </w:rPr>
+        <w:t>，将此</w:t>
+      </w:r>
+      <w:r>
+        <w:rPr>
+          <w:rFonts w:hint="eastAsia"/>
+        </w:rPr>
+        <w:t>U</w:t>
+      </w:r>
+      <w:r>
+        <w:t>R</w:t>
+      </w:r>
       <w:bookmarkStart w:id="0" w:name="_GoBack"/>
       <w:bookmarkEnd w:id="0"/>
-    </w:p>
-    <w:p/>
-    <w:p>
-      <w:r>
-        <w:lastRenderedPageBreak/>
-        <w:t>C:\Users\</w:t>
-      </w:r>
-      <w:r>
-        <w:t>G</w:t>
-      </w:r>
-      <w:r>
-        <w:rPr>
-          <w:rFonts w:hint="eastAsia"/>
-        </w:rPr>
-        <w:t>ates</w:t>
-      </w:r>
-      <w:r>
-        <w:t>\AppData\Roaming\IdentityOnChain\IdentityOnChain SDK\Sample&gt;serve -s dist</w:t>
-      </w:r>
-    </w:p>
-    <w:p/>
-    <w:p>
-      <w:pPr>
-        <w:rPr>
-          <w:rFonts w:hint="eastAsia"/>
-        </w:rPr>
-      </w:pPr>
-      <w:r>
-        <w:rPr>
-          <w:rFonts w:hint="eastAsia"/>
-        </w:rPr>
-        <w:t xml:space="preserve">   </w:t>
-      </w:r>
-      <w:r>
-        <w:rPr>
-          <w:rFonts w:hint="eastAsia"/>
-        </w:rPr>
-        <w:t>┌─────</w:t>
-      </w:r>
-      <w:r>
-        <w:rPr>
-          <w:rFonts w:hint="eastAsia"/>
-        </w:rPr>
-        <w:t>───────────────────────────────</w:t>
-      </w:r>
-      <w:r>
-        <w:rPr>
-          <w:rFonts w:hint="eastAsia"/>
-        </w:rPr>
-        <w:t>┐</w:t>
+      <w:r>
+        <w:t>L</w:t>
+      </w:r>
+      <w:r>
+        <w:rPr>
+          <w:rFonts w:hint="eastAsia"/>
+        </w:rPr>
+        <w:t>输入到测试页面文本框中，即可开始测试。</w:t>
       </w:r>
     </w:p>
     <w:p>
-      <w:pPr>
-        <w:rPr>
-          <w:rFonts w:hint="eastAsia"/>
-        </w:rPr>
-      </w:pPr>
-      <w:r>
-        <w:rPr>
-          <w:rFonts w:hint="eastAsia"/>
-        </w:rPr>
-        <w:t xml:space="preserve">   </w:t>
-      </w:r>
-      <w:r>
-        <w:rPr>
-          <w:rFonts w:hint="eastAsia"/>
-        </w:rPr>
-        <w:t>│</w:t>
-      </w:r>
-      <w:r>
-        <w:rPr>
-          <w:rFonts w:hint="eastAsia"/>
-        </w:rPr>
-        <w:t xml:space="preserve">                                          </w:t>
+      <w:r>
+        <w:rPr>
+          <w:rFonts w:hint="eastAsia"/>
+        </w:rPr>
+        <w:t>进入目录</w:t>
+      </w:r>
+      <w:r>
+        <w:rPr>
+          <w:rFonts w:hint="eastAsia"/>
+        </w:rPr>
+        <w:t xml:space="preserve"> </w:t>
+      </w:r>
+      <w:r>
+        <w:t>IdentityOnChain</w:t>
+      </w:r>
+      <w:r>
+        <w:t>\src</w:t>
       </w:r>
     </w:p>
     <w:p>
@@ -919,239 +185,7 @@
         </w:rPr>
       </w:pPr>
       <w:r>
-        <w:rPr>
-          <w:rFonts w:hint="eastAsia"/>
-        </w:rPr>
-        <w:t xml:space="preserve">   </w:t>
-      </w:r>
-      <w:r>
-        <w:rPr>
-          <w:rFonts w:hint="eastAsia"/>
-        </w:rPr>
-        <w:t>│</w:t>
-      </w:r>
-      <w:r>
-        <w:rPr>
-          <w:rFonts w:hint="eastAsia"/>
-        </w:rPr>
-        <w:t xml:space="preserve">   Serving</w:t>
-      </w:r>
-      <w:r>
-        <w:rPr>
-          <w:rFonts w:hint="eastAsia"/>
-        </w:rPr>
-        <w:t xml:space="preserve">!                         </w:t>
-      </w:r>
-    </w:p>
-    <w:p>
-      <w:pPr>
-        <w:rPr>
-          <w:rFonts w:hint="eastAsia"/>
-        </w:rPr>
-      </w:pPr>
-      <w:r>
-        <w:rPr>
-          <w:rFonts w:hint="eastAsia"/>
-        </w:rPr>
-        <w:t xml:space="preserve">   </w:t>
-      </w:r>
-      <w:r>
-        <w:rPr>
-          <w:rFonts w:hint="eastAsia"/>
-        </w:rPr>
-        <w:t>│</w:t>
-      </w:r>
-      <w:r>
-        <w:rPr>
-          <w:rFonts w:hint="eastAsia"/>
-        </w:rPr>
-        <w:t xml:space="preserve">          </w:t>
-      </w:r>
-      <w:r>
-        <w:rPr>
-          <w:rFonts w:hint="eastAsia"/>
-        </w:rPr>
-        <w:t xml:space="preserve">                               </w:t>
-      </w:r>
-    </w:p>
-    <w:p>
-      <w:pPr>
-        <w:rPr>
-          <w:rFonts w:hint="eastAsia"/>
-        </w:rPr>
-      </w:pPr>
-      <w:r>
-        <w:rPr>
-          <w:rFonts w:hint="eastAsia"/>
-        </w:rPr>
-        <w:t xml:space="preserve">   </w:t>
-      </w:r>
-      <w:r>
-        <w:rPr>
-          <w:rFonts w:hint="eastAsia"/>
-        </w:rPr>
-        <w:t>│</w:t>
-      </w:r>
-      <w:r>
-        <w:rPr>
-          <w:rFonts w:hint="eastAsia"/>
-        </w:rPr>
-        <w:t xml:space="preserve">   - Local</w:t>
-      </w:r>
-      <w:r>
-        <w:rPr>
-          <w:rFonts w:hint="eastAsia"/>
-        </w:rPr>
-        <w:t xml:space="preserve">:    http://localhost:3000     </w:t>
-      </w:r>
-    </w:p>
-    <w:p>
-      <w:pPr>
-        <w:rPr>
-          <w:rFonts w:hint="eastAsia"/>
-        </w:rPr>
-      </w:pPr>
-      <w:r>
-        <w:rPr>
-          <w:rFonts w:hint="eastAsia"/>
-        </w:rPr>
-        <w:t xml:space="preserve">   </w:t>
-      </w:r>
-      <w:r>
-        <w:rPr>
-          <w:rFonts w:hint="eastAsia"/>
-        </w:rPr>
-        <w:t>│</w:t>
-      </w:r>
-      <w:r>
-        <w:rPr>
-          <w:rFonts w:hint="eastAsia"/>
-        </w:rPr>
-        <w:t xml:space="preserve">   - Netwo</w:t>
-      </w:r>
-      <w:r>
-        <w:rPr>
-          <w:rFonts w:hint="eastAsia"/>
-        </w:rPr>
-        <w:t xml:space="preserve">rk:  http://192.168.28.1:3000  </w:t>
-      </w:r>
-    </w:p>
-    <w:p>
-      <w:pPr>
-        <w:rPr>
-          <w:rFonts w:hint="eastAsia"/>
-        </w:rPr>
-      </w:pPr>
-      <w:r>
-        <w:rPr>
-          <w:rFonts w:hint="eastAsia"/>
-        </w:rPr>
-        <w:t xml:space="preserve">   </w:t>
-      </w:r>
-      <w:r>
-        <w:rPr>
-          <w:rFonts w:hint="eastAsia"/>
-        </w:rPr>
-        <w:t>│</w:t>
-      </w:r>
-      <w:r>
-        <w:rPr>
-          <w:rFonts w:hint="eastAsia"/>
-        </w:rPr>
-        <w:t xml:space="preserve">          </w:t>
-      </w:r>
-      <w:r>
-        <w:rPr>
-          <w:rFonts w:hint="eastAsia"/>
-        </w:rPr>
-        <w:t xml:space="preserve">                               </w:t>
-      </w:r>
-    </w:p>
-    <w:p>
-      <w:pPr>
-        <w:rPr>
-          <w:rFonts w:hint="eastAsia"/>
-        </w:rPr>
-      </w:pPr>
-      <w:r>
-        <w:rPr>
-          <w:rFonts w:hint="eastAsia"/>
-        </w:rPr>
-        <w:t xml:space="preserve">   </w:t>
-      </w:r>
-      <w:r>
-        <w:rPr>
-          <w:rFonts w:hint="eastAsia"/>
-        </w:rPr>
-        <w:t>│</w:t>
-      </w:r>
-      <w:r>
-        <w:rPr>
-          <w:rFonts w:hint="eastAsia"/>
-        </w:rPr>
-        <w:t xml:space="preserve">   Copied </w:t>
-      </w:r>
-      <w:r>
-        <w:rPr>
-          <w:rFonts w:hint="eastAsia"/>
-        </w:rPr>
-        <w:t xml:space="preserve">local address to clipboard!    </w:t>
-      </w:r>
-    </w:p>
-    <w:p>
-      <w:pPr>
-        <w:rPr>
-          <w:rFonts w:hint="eastAsia"/>
-        </w:rPr>
-      </w:pPr>
-      <w:r>
-        <w:rPr>
-          <w:rFonts w:hint="eastAsia"/>
-        </w:rPr>
-        <w:t xml:space="preserve">   </w:t>
-      </w:r>
-      <w:r>
-        <w:rPr>
-          <w:rFonts w:hint="eastAsia"/>
-        </w:rPr>
-        <w:t>└─────</w:t>
-      </w:r>
-      <w:r>
-        <w:rPr>
-          <w:rFonts w:hint="eastAsia"/>
-        </w:rPr>
-        <w:t>───────────────────────────────</w:t>
-      </w:r>
-      <w:r>
-        <w:rPr>
-          <w:rFonts w:hint="eastAsia"/>
-        </w:rPr>
-        <w:t>┘</w:t>
-      </w:r>
-    </w:p>
-    <w:p>
-      <w:pPr>
-        <w:rPr>
-          <w:rFonts w:hint="eastAsia"/>
-        </w:rPr>
-      </w:pPr>
-      <w:r>
-        <w:rPr>
-          <w:rFonts w:hint="eastAsia"/>
-        </w:rPr>
-        <w:t>按照提示打开</w:t>
-      </w:r>
-      <w:r>
-        <w:rPr>
-          <w:rFonts w:hint="eastAsia"/>
-        </w:rPr>
-        <w:t>local</w:t>
-      </w:r>
-      <w:r>
-        <w:rPr>
-          <w:rFonts w:hint="eastAsia"/>
-        </w:rPr>
-        <w:t>链接即可测试相关功能。首次安装完成如果是自动启动节点和测试网页，会一次性打开多个控制台窗口，请注意查找以上窗口是否存在，如果不存在，可以通过桌面快捷方式手动启动。</w:t>
+        <w:t>Npm run dev</w:t>
       </w:r>
     </w:p>
     <w:p>
@@ -1206,7 +240,7 @@
                     <pic:cNvPicPr/>
                   </pic:nvPicPr>
                   <pic:blipFill>
-                    <a:blip r:embed="rId12">
+                    <a:blip r:embed="rId8">
                       <a:extLst>
                         <a:ext uri="{28A0092B-C50C-407E-A947-70E740481C1C}">
                           <a14:useLocalDpi xmlns:a14="http://schemas.microsoft.com/office/drawing/2010/main" val="0"/>
@@ -2389,7 +1423,7 @@
 </file>
 
 <file path=customXml/itemProps1.xml><?xml version="1.0" encoding="utf-8"?>
-<ds:datastoreItem xmlns:ds="http://schemas.openxmlformats.org/officeDocument/2006/customXml" ds:itemID="{5C3195EE-C03E-4352-B9C5-E3A58864D2DB}">
+<ds:datastoreItem xmlns:ds="http://schemas.openxmlformats.org/officeDocument/2006/customXml" ds:itemID="{243B4184-2B17-446A-A41B-5E615A8FC750}">
   <ds:schemaRefs>
     <ds:schemaRef ds:uri="http://schemas.openxmlformats.org/officeDocument/2006/bibliography"/>
   </ds:schemaRefs>

</xml_diff>